<commit_message>
adding reports with github repo link
</commit_message>
<xml_diff>
--- a/apb_verification_MS1_Trad/doc/ECE 593 Design SpecificationTeam2.docx
+++ b/apb_verification_MS1_Trad/doc/ECE 593 Design SpecificationTeam2.docx
@@ -94,6 +94,45 @@
     </w:p>
     <w:p>
       <w:pPr>
+        <w:ind w:firstLine="720"/>
+        <w:rPr/>
+      </w:pPr>
+      <w:r>
+        <w:rPr>
+          <w:rtl w:val="0"/>
+        </w:rPr>
+      </w:r>
+    </w:p>
+    <w:p>
+      <w:pPr>
+        <w:ind w:firstLine="720"/>
+        <w:rPr/>
+      </w:pPr>
+      <w:r>
+        <w:rPr>
+          <w:rtl w:val="0"/>
+        </w:rPr>
+        <w:t xml:space="preserve">The group will use the following Github repository for version control and Milestone tracking: </w:t>
+      </w:r>
+      <w:hyperlink r:id="rId7">
+        <w:r>
+          <w:rPr>
+            <w:color w:val="1155cc"/>
+            <w:u w:val="single"/>
+            <w:rtl w:val="0"/>
+          </w:rPr>
+          <w:t xml:space="preserve">https://github.com/tnl3pdx/ece593-apb-verification</w:t>
+        </w:r>
+      </w:hyperlink>
+      <w:r>
+        <w:rPr>
+          <w:rtl w:val="0"/>
+        </w:rPr>
+        <w:t xml:space="preserve"> </w:t>
+      </w:r>
+    </w:p>
+    <w:p>
+      <w:pPr>
         <w:pStyle w:val="Heading3"/>
         <w:rPr/>
       </w:pPr>
@@ -339,7 +378,7 @@
       </w:r>
     </w:p>
     <w:sectPr>
-      <w:headerReference r:id="rId7" w:type="default"/>
+      <w:headerReference r:id="rId8" w:type="default"/>
       <w:pgSz w:h="15840" w:w="12240" w:orient="portrait"/>
       <w:pgMar w:bottom="1440" w:top="1440" w:left="1440" w:right="1440" w:header="720" w:footer="720"/>
       <w:pgNumType w:start="1"/>

</xml_diff>